<commit_message>
feat: DOCX 주석(comments.xml)을 각주 형태로 추출 (v4.10.28)
word/comments.xml을 전혀 읽지 않아 Word 주석이 항상 사라지던 문제를
QUALITY_HISTORY의 기존 계획대로 해결. w:commentReference를 만나면
기존 각주(run.footnote)와 동일한 경로로 "[주석] 작성자: 내용"을
삽입한다. commentRangeStart/End(하이라이트 범위)는 다루지 않고
앵커 위치만 사용하는 스코프로 제한했다.
</commit_message>
<xml_diff>
--- a/tests/fixtures/sample.docx
+++ b/tests/fixtures/sample.docx
@@ -46,6 +46,16 @@
     <w:p>
       <w:r>
         <w:t>목록 항목 English</w:t>
+      </w:r>
+    </w:p>
+    <w:p>
+      <w:commentRangeStart w:id="0"/>
+      <w:r>
+        <w:t>주석이 달린 문장</w:t>
+      </w:r>
+      <w:commentRangeEnd w:id="0"/>
+      <w:r>
+        <w:commentReference w:id="0"/>
       </w:r>
     </w:p>
     <w:tbl>
@@ -151,6 +161,18 @@
 </w:document>
 </file>
 
+<file path=word/comments.xml><?xml version="1.0" encoding="utf-8"?>
+<w:comments xmlns:w="http://schemas.openxmlformats.org/wordprocessingml/2006/main">
+  <w:comment w:id="0" w:author="골든테스터">
+    <w:p>
+      <w:r>
+        <w:t>주석 내용 확인용</w:t>
+      </w:r>
+    </w:p>
+  </w:comment>
+</w:comments>
+</file>
+
 <file path=word/styles.xml><?xml version="1.0" encoding="utf-8"?>
 <w:styles xmlns:w="http://schemas.openxmlformats.org/wordprocessingml/2006/main">
   <w:style w:type="paragraph" w:styleId="Heading1">

</xml_diff>

<commit_message>
feat: DOCX 주석(comments.xml)을 각주 형태로 추출 (v4.10.28) (#114)
word/comments.xml을 전혀 읽지 않아 Word 주석이 항상 사라지던 문제를
QUALITY_HISTORY의 기존 계획대로 해결. w:commentReference를 만나면
기존 각주(run.footnote)와 동일한 경로로 "[주석] 작성자: 내용"을
삽입한다. commentRangeStart/End(하이라이트 범위)는 다루지 않고
앵커 위치만 사용하는 스코프로 제한했다.
</commit_message>
<xml_diff>
--- a/tests/fixtures/sample.docx
+++ b/tests/fixtures/sample.docx
@@ -46,6 +46,16 @@
     <w:p>
       <w:r>
         <w:t>목록 항목 English</w:t>
+      </w:r>
+    </w:p>
+    <w:p>
+      <w:commentRangeStart w:id="0"/>
+      <w:r>
+        <w:t>주석이 달린 문장</w:t>
+      </w:r>
+      <w:commentRangeEnd w:id="0"/>
+      <w:r>
+        <w:commentReference w:id="0"/>
       </w:r>
     </w:p>
     <w:tbl>
@@ -151,6 +161,18 @@
 </w:document>
 </file>
 
+<file path=word/comments.xml><?xml version="1.0" encoding="utf-8"?>
+<w:comments xmlns:w="http://schemas.openxmlformats.org/wordprocessingml/2006/main">
+  <w:comment w:id="0" w:author="골든테스터">
+    <w:p>
+      <w:r>
+        <w:t>주석 내용 확인용</w:t>
+      </w:r>
+    </w:p>
+  </w:comment>
+</w:comments>
+</file>
+
 <file path=word/styles.xml><?xml version="1.0" encoding="utf-8"?>
 <w:styles xmlns:w="http://schemas.openxmlformats.org/wordprocessingml/2006/main">
   <w:style w:type="paragraph" w:styleId="Heading1">

</xml_diff>